<commit_message>
Report three-seed robustness for label noise, missing values and calibration drift
</commit_message>
<xml_diff>
--- a/重构版论文_v4_20260915/中文SCI论文_v4_重构版.docx
+++ b/重构版论文_v4_20260915/中文SCI论文_v4_重构版.docx
@@ -9561,7 +9561,7 @@
         <w:t>扩展鲁棒性。</w:t>
       </w:r>
       <w:r>
-        <w:t xml:space="preserve"> 我们另外考察了三类失效模式。监督信号被污染相对无害：把训练标签随机翻转 5% 与 10%，条件加权机制的 Macro-F1 相对下降仅 0.6% 与 1.3%，等权森林均为 0.8%。缺失测量更具破坏性——把 10% 的测试特征值替换为训练集中位数，两者分别下降 4.3% 与 4.0%；而标定漂移在三者中最严重：给 20% 的特征列加上训练值域的 1%，两者分别下降 17.2% 与 18.8%。按全部扰动的严重程度排序，</w:t>
+        <w:t xml:space="preserve"> 我们另外考察了三类失效模式，均在三个种子上评测。监督信号被污染相对无害：把训练标签随机翻转 5% 与 10%，条件加权机制的 Macro-F1 相对下降仅 0.57% 与 0.97%，等权森林为 0.77% 与 1.00%。缺失测量更具破坏性——把 10% 的测试特征值替换为训练集中位数，两者分别下降 4.21% 与 4.25%；而标定漂移在三者中最严重：给 20% 的特征列加上训练值域的 1%，两者分别下降 17.23% 与 18.24%。按全部扰动的严重程度排序，</w:t>
       </w:r>
       <w:r>
         <w:rPr>
@@ -9570,7 +9570,7 @@
         <w:t>特征值本身的连续污染占主导</w:t>
       </w:r>
       <w:r>
-        <w:t>（1% 高斯噪声 43.3%、标定漂移 17–19%、10% 缺失值 4%），而监督被污染的危害小一个数量级（0.6–1.3%）。这一排序具有实践意义：数据集批评多聚焦于标签噪声，而对测量漂移关注不足。这三类条件在单个种子上评测，作为探索性诊断报告。</w:t>
+        <w:t>（1% 高斯噪声 43.3%、标定漂移 17–18%、10% 缺失值 4.2%），而监督被污染的危害小一个数量级（0.6–1.0%）。这一排序具有实践意义：数据集批评多聚焦于标签噪声，而对测量漂移关注不足。</w:t>
       </w:r>
     </w:p>
     <w:p>

</xml_diff>

<commit_message>
Round 14: character-level proofing sweep (out-of-fold terminology, widths, symbols)
</commit_message>
<xml_diff>
--- a/重构版论文_v4_20260915/中文SCI论文_v4_重构版.docx
+++ b/重构版论文_v4_20260915/中文SCI论文_v4_重构版.docx
@@ -2813,7 +2813,7 @@
         <w:t>交叉拟合的风险模型。</w:t>
       </w:r>
       <w:r>
-        <w:t xml:space="preserve"> 条件加权的风险模型使用 K 折交叉拟合的袋外概率作为输入，折内选择器重新拟合，避免用同一批数据同时训练专家与估计专家可靠性。</w:t>
+        <w:t xml:space="preserve"> 条件加权的风险模型使用 K 折交叉拟合的折外概率作为输入，折内选择器重新拟合，避免用同一批数据同时训练专家与估计专家可靠性。</w:t>
       </w:r>
     </w:p>
     <w:p>
@@ -3037,7 +3037,7 @@
         <w:t>第一步，构造可靠性描述子。</w:t>
       </w:r>
       <w:r>
-        <w:t xml:space="preserve"> 用 K 折交叉拟合得到每个专家的袋外概率，并从中提取三个描述子：置信度（最大类概率）、归一化熵（预测不确定性）、以及前两类的概率边距。这些描述子只使用训练分区内的袋外预测，不接触验证与测试标签。</w:t>
+        <w:t xml:space="preserve"> 用 K 折交叉拟合得到每个专家的折外概率，并从中提取三个描述子：置信度（最大类概率）、归一化熵（预测不确定性）、以及前两类的概率边距。这些描述子只使用训练分区内的袋外预测，不接触验证与测试标签。</w:t>
       </w:r>
     </w:p>
     <w:p>
@@ -3048,7 +3048,7 @@
         <w:t>第二步，拟合风险模型。</w:t>
       </w:r>
       <w:r>
-        <w:t xml:space="preserve"> 对每个专家 e，用其袋外概率与描述子拟合一个逻辑回归风险模型 r_e(x)。风险值越高，表示该专家在类似样本上越不可靠。</w:t>
+        <w:t xml:space="preserve"> 对每个专家 e，用其折外概率与描述子拟合一个逻辑回归风险模型 r_e(x)。风险值越高，表示该专家在类似样本上越不可靠。</w:t>
       </w:r>
     </w:p>
     <w:p>
@@ -3209,7 +3209,7 @@
           <w:rFonts w:ascii="Consolas" w:hAnsi="Consolas"/>
           <w:sz w:val="17"/>
         </w:rPr>
-        <w:t>2. 对每一折、每一专家视图 q ∈ {full, chi2, MI, ANOVA}：</w:t>
+        <w:t>2. 对每一折、每一专家视图 q ∈ {full, χ², MI, ANOVA}：</w:t>
       </w:r>
     </w:p>
     <w:p>
@@ -3245,7 +3245,7 @@
           <w:rFonts w:ascii="Consolas" w:hAnsi="Consolas"/>
           <w:sz w:val="17"/>
         </w:rPr>
-        <w:t xml:space="preserve">       预测被留出的折，保存袋外概率与不确定性描述子。</w:t>
+        <w:t xml:space="preserve">       预测被留出的折，保存折外概率与不确定性描述子。</w:t>
       </w:r>
     </w:p>
     <w:p>
@@ -3257,7 +3257,7 @@
           <w:rFonts w:ascii="Consolas" w:hAnsi="Consolas"/>
           <w:sz w:val="17"/>
         </w:rPr>
-        <w:t>3. 用完整袋外表为每个视图拟合一个逻辑回归风险模型 r_q。</w:t>
+        <w:t>3. 用完整折外表为每个视图拟合一个逻辑回归风险模型 r_q。</w:t>
       </w:r>
     </w:p>
     <w:p>
@@ -3375,7 +3375,7 @@
     </w:p>
     <w:p>
       <w:r>
-        <w:t>*证明.* 由 Σ w_e = 1 与 p_e ≡ p，有 Σ w_e p_e = (Σ w_e) p = p。凸组合不改变概率向量，故 argmax 不变。∎</w:t>
+        <w:t>*证明。* 由 Σ w_e = 1 与 p_e ≡ p，有 Σ w_e p_e = (Σ w_e) p = p。凸组合不改变概率向量，故 argmax 不变。∎</w:t>
       </w:r>
     </w:p>
     <w:p>
@@ -3485,7 +3485,7 @@
     </w:p>
     <w:p>
       <w:r>
-        <w:t>*证明.* 融合概率对权重的敏感度由各专家概率向量之间的最大偏差界定。设 Δ 为权重变动引起的融合概率 L1 变化的上界，则当 Δ &lt; m(x) 时，argmax 在扰动前后相同。∎</w:t>
+        <w:t>*证明。* 融合概率对权重的敏感度由各专家概率向量之间的最大偏差界定。设 Δ 为权重变动引起的融合概率 L1 变化的上界，则当 Δ &lt; m(x) 时，argmax 在扰动前后相同。∎</w:t>
       </w:r>
     </w:p>
     <w:p>
@@ -7979,7 +7979,7 @@
         <w:t>\in\{</w:t>
       </w:r>
       <w:r>
-        <w:t>全量, 仅熵, 仅边距</w:t>
+        <w:t>全量、仅熵、仅边距</w:t>
       </w:r>
       <w:r>
         <w:rPr>

</xml_diff>